<commit_message>
Prepare Railway deployment and hosted ingestion
</commit_message>
<xml_diff>
--- a/Documentations/AI_Method_Statement_Studio_PRD_v3.docx
+++ b/Documentations/AI_Method_Statement_Studio_PRD_v3.docx
@@ -53818,6 +53818,225 @@
         <w:rPr>
           <w:rtl w:val="0"/>
         </w:rPr>
+      </w:r>
+    </w:p>
+    <w:p>
+      <w:r>
+        <w:br w:type="page"/>
+      </w:r>
+    </w:p>
+    <w:p>
+      <w:pPr>
+        <w:pStyle w:val="Heading1"/>
+      </w:pPr>
+      <w:r>
+        <w:rPr>
+          <w:rFonts w:ascii="Aptos Display" w:hAnsi="Aptos Display"/>
+          <w:b/>
+          <w:color w:val="1F4E79"/>
+          <w:sz w:val="32"/>
+        </w:rPr>
+        <w:t>Latest Development Addendum - 2026-05-04</w:t>
+      </w:r>
+    </w:p>
+    <w:p>
+      <w:r>
+        <w:rPr>
+          <w:rFonts w:ascii="Aptos" w:hAnsi="Aptos"/>
+          <w:sz w:val="20"/>
+        </w:rPr>
+        <w:t>This addendum records implementation decisions and deployment-readiness changes completed after PRD v3.0. It does not replace the PRD source-authority hierarchy or no-silent-assumption principles; it clarifies the current implementation baseline.</w:t>
+      </w:r>
+    </w:p>
+    <w:p>
+      <w:pPr>
+        <w:pStyle w:val="Heading2"/>
+      </w:pPr>
+      <w:r>
+        <w:rPr>
+          <w:rFonts w:ascii="Aptos Display" w:hAnsi="Aptos Display"/>
+          <w:b/>
+          <w:color w:val="1F4E79"/>
+          <w:sz w:val="24"/>
+        </w:rPr>
+        <w:t>Implemented Platform Baseline</w:t>
+      </w:r>
+    </w:p>
+    <w:p>
+      <w:r>
+        <w:rPr>
+          <w:rFonts w:ascii="Aptos" w:hAnsi="Aptos"/>
+          <w:sz w:val="20"/>
+        </w:rPr>
+        <w:t>- Hosted target is Railway with two services: ams-web for Next.js and ams-worker for BullMQ background jobs.</w:t>
+      </w:r>
+    </w:p>
+    <w:p>
+      <w:r>
+        <w:rPr>
+          <w:rFonts w:ascii="Aptos" w:hAnsi="Aptos"/>
+          <w:sz w:val="20"/>
+        </w:rPr>
+        <w:t>- Cloudflare R2 is the preferred hosted object store for uploaded PDFs and generated exports, using the S3-compatible API.</w:t>
+      </w:r>
+    </w:p>
+    <w:p>
+      <w:r>
+        <w:rPr>
+          <w:rFonts w:ascii="Aptos" w:hAnsi="Aptos"/>
+          <w:sz w:val="20"/>
+        </w:rPr>
+        <w:t>- A public /api/health endpoint now validates environment configuration, database connectivity, and Redis connectivity for hosted readiness.</w:t>
+      </w:r>
+    </w:p>
+    <w:p>
+      <w:r>
+        <w:rPr>
+          <w:rFonts w:ascii="Aptos" w:hAnsi="Aptos"/>
+          <w:sz w:val="20"/>
+        </w:rPr>
+        <w:t>- Runtime .env editing is disabled in production by default. Production secrets should be managed through Railway variables.</w:t>
+      </w:r>
+    </w:p>
+    <w:p>
+      <w:pPr>
+        <w:pStyle w:val="Heading2"/>
+      </w:pPr>
+      <w:r>
+        <w:rPr>
+          <w:rFonts w:ascii="Aptos Display" w:hAnsi="Aptos Display"/>
+          <w:b/>
+          <w:color w:val="1F4E79"/>
+          <w:sz w:val="24"/>
+        </w:rPr>
+        <w:t>Implemented Ingestion Baseline</w:t>
+      </w:r>
+    </w:p>
+    <w:p>
+      <w:r>
+        <w:rPr>
+          <w:rFonts w:ascii="Aptos" w:hAnsi="Aptos"/>
+          <w:sz w:val="20"/>
+        </w:rPr>
+        <w:t>- Settings -&gt; Import supports browser PDF upload for hosted deployments and local folder import for local development only.</w:t>
+      </w:r>
+    </w:p>
+    <w:p>
+      <w:r>
+        <w:rPr>
+          <w:rFonts w:ascii="Aptos" w:hAnsi="Aptos"/>
+          <w:sz w:val="20"/>
+        </w:rPr>
+        <w:t>- Uploaded PDFs are fingerprinted; files already pending, running, or complete for the same trade are skipped on reimport.</w:t>
+      </w:r>
+    </w:p>
+    <w:p>
+      <w:r>
+        <w:rPr>
+          <w:rFonts w:ascii="Aptos" w:hAnsi="Aptos"/>
+          <w:sz w:val="20"/>
+        </w:rPr>
+        <w:t>- Ingestion includes status/progress visibility, batch filtering, and terminate controls for individual and active/queued jobs.</w:t>
+      </w:r>
+    </w:p>
+    <w:p>
+      <w:r>
+        <w:rPr>
+          <w:rFonts w:ascii="Aptos" w:hAnsi="Aptos"/>
+          <w:sz w:val="20"/>
+        </w:rPr>
+        <w:t>- Document AI OCR supports Z.ai GLM-OCR with provider size/page-limit batching and rate-limit cooldown handling.</w:t>
+      </w:r>
+    </w:p>
+    <w:p>
+      <w:pPr>
+        <w:pStyle w:val="Heading2"/>
+      </w:pPr>
+      <w:r>
+        <w:rPr>
+          <w:rFonts w:ascii="Aptos Display" w:hAnsi="Aptos Display"/>
+          <w:b/>
+          <w:color w:val="1F4E79"/>
+          <w:sz w:val="24"/>
+        </w:rPr>
+        <w:t>Implemented Drafting Baseline</w:t>
+      </w:r>
+    </w:p>
+    <w:p>
+      <w:r>
+        <w:rPr>
+          <w:rFonts w:ascii="Aptos" w:hAnsi="Aptos"/>
+          <w:sz w:val="20"/>
+        </w:rPr>
+        <w:t>- Draft Editor supports section-level user input before drafting.</w:t>
+      </w:r>
+    </w:p>
+    <w:p>
+      <w:r>
+        <w:rPr>
+          <w:rFonts w:ascii="Aptos" w:hAnsi="Aptos"/>
+          <w:sz w:val="20"/>
+        </w:rPr>
+        <w:t>- The drafting worker combines user input, uploaded project document passages, selected precedent passages, gaps, conflicts, and section context.</w:t>
+      </w:r>
+    </w:p>
+    <w:p>
+      <w:r>
+        <w:rPr>
+          <w:rFonts w:ascii="Aptos" w:hAnsi="Aptos"/>
+          <w:sz w:val="20"/>
+        </w:rPr>
+        <w:t>- Draft output preserves [GAP:] markers when source evidence is missing, supporting P1 no silent assumption and P6 traceability.</w:t>
+      </w:r>
+    </w:p>
+    <w:p>
+      <w:pPr>
+        <w:pStyle w:val="Heading2"/>
+      </w:pPr>
+      <w:r>
+        <w:rPr>
+          <w:rFonts w:ascii="Aptos Display" w:hAnsi="Aptos Display"/>
+          <w:b/>
+          <w:color w:val="1F4E79"/>
+          <w:sz w:val="24"/>
+        </w:rPr>
+        <w:t>Current Verification</w:t>
+      </w:r>
+    </w:p>
+    <w:p>
+      <w:r>
+        <w:rPr>
+          <w:rFonts w:ascii="Aptos" w:hAnsi="Aptos"/>
+          <w:sz w:val="20"/>
+        </w:rPr>
+        <w:t>- Repo-wide pnpm typecheck passes.</w:t>
+      </w:r>
+    </w:p>
+    <w:p>
+      <w:r>
+        <w:rPr>
+          <w:rFonts w:ascii="Aptos" w:hAnsi="Aptos"/>
+          <w:sz w:val="20"/>
+        </w:rPr>
+        <w:t>- pnpm railway:web:build passes.</w:t>
+      </w:r>
+    </w:p>
+    <w:p>
+      <w:r>
+        <w:rPr>
+          <w:rFonts w:ascii="Aptos" w:hAnsi="Aptos"/>
+          <w:sz w:val="20"/>
+        </w:rPr>
+        <w:t>- pnpm railway:worker:build passes.</w:t>
+      </w:r>
+    </w:p>
+    <w:p>
+      <w:r>
+        <w:rPr>
+          <w:rFonts w:ascii="Aptos" w:hAnsi="Aptos"/>
+          <w:sz w:val="20"/>
+        </w:rPr>
+        <w:t>- Worker startup smoke test reaches the ready state.</w:t>
       </w:r>
     </w:p>
     <w:sectPr>

</xml_diff>